<commit_message>
Replace sample video with actual video
</commit_message>
<xml_diff>
--- a/public/images/video links.docx
+++ b/public/images/video links.docx
@@ -24,19 +24,7 @@
           <w:rPr>
             <w:rStyle w:val="Hyperlink"/>
           </w:rPr>
-          <w:t>https://www.youtube.c</w:t>
-        </w:r>
-        <w:r>
-          <w:rPr>
-            <w:rStyle w:val="Hyperlink"/>
-          </w:rPr>
-          <w:t>o</w:t>
-        </w:r>
-        <w:r>
-          <w:rPr>
-            <w:rStyle w:val="Hyperlink"/>
-          </w:rPr>
-          <w:t>m/watch?v=z7RiKWovHSk&amp;pp=ygURYmFydGhvbG9tZXcgYXJtYWg%3D</w:t>
+          <w:t>https://www.youtube.com/watch?v=z7RiKWovHSk&amp;pp=ygURYmFydGhvbG9tZXcgYXJtYWg%3D</w:t>
         </w:r>
       </w:hyperlink>
     </w:p>
@@ -46,19 +34,7 @@
           <w:rPr>
             <w:rStyle w:val="Hyperlink"/>
           </w:rPr>
-          <w:t>https://www.youtube.com/watch?v=e</w:t>
-        </w:r>
-        <w:r>
-          <w:rPr>
-            <w:rStyle w:val="Hyperlink"/>
-          </w:rPr>
-          <w:t>a</w:t>
-        </w:r>
-        <w:r>
-          <w:rPr>
-            <w:rStyle w:val="Hyperlink"/>
-          </w:rPr>
-          <w:t>VENMmWQhM&amp;pp=ygURYmFydGhvbG9tZXcgYXJtYWg%3D</w:t>
+          <w:t>https://www.youtube.com/watch?v=eaVENMmWQhM&amp;pp=ygURYmFydGhvbG9tZXcgYXJtYWg%3D</w:t>
         </w:r>
       </w:hyperlink>
     </w:p>
@@ -123,19 +99,7 @@
           <w:rPr>
             <w:rStyle w:val="Hyperlink"/>
           </w:rPr>
-          <w:t>https://you</w:t>
-        </w:r>
-        <w:r>
-          <w:rPr>
-            <w:rStyle w:val="Hyperlink"/>
-          </w:rPr>
-          <w:t>t</w:t>
-        </w:r>
-        <w:r>
-          <w:rPr>
-            <w:rStyle w:val="Hyperlink"/>
-          </w:rPr>
-          <w:t>u.be/LxcmMxEoTbo</w:t>
+          <w:t>https://youtu.be/LxcmMxEoTbo</w:t>
         </w:r>
       </w:hyperlink>
     </w:p>
@@ -187,19 +151,7 @@
           <w:rPr>
             <w:rStyle w:val="Hyperlink"/>
           </w:rPr>
-          <w:t>https://youtu.b</w:t>
-        </w:r>
-        <w:r>
-          <w:rPr>
-            <w:rStyle w:val="Hyperlink"/>
-          </w:rPr>
-          <w:t>e</w:t>
-        </w:r>
-        <w:r>
-          <w:rPr>
-            <w:rStyle w:val="Hyperlink"/>
-          </w:rPr>
-          <w:t>/cb09kRXLiA8</w:t>
+          <w:t>https://youtu.be/cb09kRXLiA8</w:t>
         </w:r>
       </w:hyperlink>
     </w:p>
@@ -212,27 +164,12 @@
           <w:rPr>
             <w:rStyle w:val="Hyperlink"/>
           </w:rPr>
-          <w:t>https://youtu.be/b</w:t>
-        </w:r>
-        <w:r>
-          <w:rPr>
-            <w:rStyle w:val="Hyperlink"/>
-          </w:rPr>
-          <w:t>n</w:t>
-        </w:r>
-        <w:r>
-          <w:rPr>
-            <w:rStyle w:val="Hyperlink"/>
-          </w:rPr>
-          <w:t>wt0069yKc</w:t>
+          <w:t>https://youtu.be/bnwt0069yKc</w:t>
         </w:r>
       </w:hyperlink>
     </w:p>
     <w:p>
       <w:r>
-        <w:rPr>
-          <w:highlight w:val="yellow"/>
-        </w:rPr>
         <w:t>AEC Climate smart industrialization</w:t>
       </w:r>
       <w:r>
@@ -243,7 +180,19 @@
           <w:rPr>
             <w:rStyle w:val="Hyperlink"/>
           </w:rPr>
-          <w:t>https://youtu.be/eaVENMmWQhM</w:t>
+          <w:t>https://you</w:t>
+        </w:r>
+        <w:r>
+          <w:rPr>
+            <w:rStyle w:val="Hyperlink"/>
+          </w:rPr>
+          <w:t>t</w:t>
+        </w:r>
+        <w:r>
+          <w:rPr>
+            <w:rStyle w:val="Hyperlink"/>
+          </w:rPr>
+          <w:t>u.be/eaVENMmWQhM</w:t>
         </w:r>
       </w:hyperlink>
     </w:p>
@@ -285,19 +234,7 @@
           <w:rPr>
             <w:rStyle w:val="Hyperlink"/>
           </w:rPr>
-          <w:t>https://www.youtube.com/watch?v=BxPAbIkkNR8&amp;pp</w:t>
-        </w:r>
-        <w:r>
-          <w:rPr>
-            <w:rStyle w:val="Hyperlink"/>
-          </w:rPr>
-          <w:t>=</w:t>
-        </w:r>
-        <w:r>
-          <w:rPr>
-            <w:rStyle w:val="Hyperlink"/>
-          </w:rPr>
-          <w:t>ygURYmFydGhvbG9tZXcgYXJtYWg%3D</w:t>
+          <w:t>https://www.youtube.com/watch?v=BxPAbIkkNR8&amp;pp=ygURYmFydGhvbG9tZXcgYXJtYWg%3D</w:t>
         </w:r>
       </w:hyperlink>
     </w:p>

</xml_diff>